<commit_message>
feat: configure FuelFlux settings and factory image releases
Read immutable startup identity and backend settings across API clients while retaining DNS caching. Publish a matching ARM64 executable and checksums with verified Debian packaging. Update the Russian Word factory instruction for in-place image editing and HDD Raw Copy Tool.
</commit_message>
<xml_diff>
--- a/doc/fuelflux_factory_instruction_ru.docx
+++ b/doc/fuelflux_factory_instruction_ru.docx
@@ -7,7 +7,7 @@
         <w:pStyle w:val="Title"/>
       </w:pPr>
       <w:r>
-        <w:t>Настройка образа FuelFlux в Windows</w:t>
+        <w:t>Подготовка заводского образа FuelFlux</w:t>
       </w:r>
     </w:p>
     <w:p>
@@ -15,7 +15,7 @@
         <w:pStyle w:val="Subtitle"/>
       </w:pPr>
       <w:r>
-        <w:t>Инструкция для партии из пяти контроллеров</w:t>
+        <w:t>Windows и WSL 2  •  Партия из пяти Orange Pi</w:t>
       </w:r>
     </w:p>
     <w:p>
@@ -23,7 +23,7 @@
         <w:rPr>
           <w:b w:val="0"/>
         </w:rPr>
-        <w:t>Инструкция описывает настройку ID контроллера и порта обратного SSH-туннеля через WSL 2, запись карты памяти и проверку устройства. Ubuntu, fuelflux и fuelflux.srv уже должны быть установлены в образе.</w:t>
+        <w:t>Инструкция предназначена для подготовки карт памяти с Ubuntu от Orange Pi, установленными fuelflux и fuelflux.srv. Она описывает назначение ID, адреса API и порта SSH, замену исполняемого файла внутри образа и запись карты через HDD Raw Copy Tool.</w:t>
       </w:r>
     </w:p>
     <w:p>
@@ -31,7 +31,15 @@
         <w:rPr>
           <w:b/>
         </w:rPr>
-        <w:t>Исходный файл: D:\images\fuelflux.img. Он редактируется на месте; копирование образа в WSL и обратный экспорт не выполняются. Все изменения сразу записываются в этот файл.</w:t>
+        <w:t>Рабочий файл D:\images\fuelflux.img редактируется на месте. Копировать образ в WSL или экспортировать его обратно не нужно. Изменения сразу записываются в этот файл.</w:t>
+      </w:r>
+    </w:p>
+    <w:p>
+      <w:pPr>
+        <w:pStyle w:val="Heading1"/>
+      </w:pPr>
+      <w:r>
+        <w:t>Условия начала работы</w:t>
       </w:r>
     </w:p>
     <w:p>
@@ -39,7 +47,15 @@
         <w:rPr>
           <w:b w:val="0"/>
         </w:rPr>
-        <w:t>Для каждого устройства выполните полный цикл: назначьте параметры, отключите образ от WSL, прошейте одну карту и запишите результат в журнал партии. Затем снова подключите тот же образ и задайте параметры следующего устройства.</w:t>
+        <w:t>Используйте чистый заводской образ без рабочих операций, очереди неотправленных сообщений и данных предыдущего контроллера. Перед назначением нового ID или сервера подтвердите это условие. Перенос рабочих баз между ID и серверами в эту процедуру не входит. Не очищайте неизвестные базы вручную.</w:t>
+      </w:r>
+    </w:p>
+    <w:p>
+      <w:r>
+        <w:rPr>
+          <w:b w:val="0"/>
+        </w:rPr>
+        <w:t>В образе должны быть установлены обе службы, их зависимости и настройки оборудования. Для копий заранее предусмотрите уникальные machine-id и SSH host keys, а также авторизованные ключи туннеля. Образ во время редактирования не должен использоваться другой программой.</w:t>
       </w:r>
     </w:p>
     <w:p>
@@ -55,7 +71,7 @@
         <w:rPr>
           <w:b w:val="0"/>
         </w:rPr>
-        <w:t>Выберите любые допустимые свободные ID, согласованные с серверной системой FuelFlux. ID должны быть уникальными и при необходимости заранее зарегистрированными на сервере. Ниже приведены примеры из 15 цифр; они не считаются зарезервированными автоматически.</w:t>
+        <w:t>Согласуйте с сервером любые свободные допустимые ID. Приложение хранит ID как строку, включая ведущие нули и буквы; сервер может вводить собственные ограничения. Следующие значения — примеры, их нужно проверить и при необходимости зарегистрировать.</w:t>
       </w:r>
     </w:p>
     <w:tbl>
@@ -573,23 +589,7 @@
         <w:rPr>
           <w:b w:val="0"/>
         </w:rPr>
-        <w:t>Исходный порт туннеля в образе равен 8088. Назначайте свободные порты начиная с 22001 и далее по одному на каждый контроллер, использующий тот же удаленный сервер.</w:t>
-      </w:r>
-    </w:p>
-    <w:p>
-      <w:pPr>
-        <w:pStyle w:val="Heading1"/>
-      </w:pPr>
-      <w:r>
-        <w:t>Проверка версии приложения</w:t>
-      </w:r>
-    </w:p>
-    <w:p>
-      <w:r>
-        <w:rPr>
-          <w:b/>
-        </w:rPr>
-        <w:t>В проверенных 24 октября 2026 года исходниках основной API-клиент берет ID из константы CONTROLLER_UID, а контроллер и фоновая отправка читают FUELFLUX_CONTROLLER_ID. Поэтому изменение файла конфигурации само по себе не гарантирует смену ID во всех запросах. Для выпуска партии используйте пакет с исправленной передачей ID и обязательно выполните проверку на странице 5.</w:t>
+        <w:t>Для каждого устройства полностью завершайте цикл редактирования и записи карты до изменения параметров следующего устройства. Ведите журнал партии с ID, портом, URL, версией и результатом приемки.</w:t>
       </w:r>
     </w:p>
     <w:p>
@@ -602,7 +602,7 @@
         <w:pStyle w:val="Heading1"/>
       </w:pPr>
       <w:r>
-        <w:t>1 Подготовка WSL</w:t>
+        <w:t>1 Подготовка WSL 2</w:t>
       </w:r>
     </w:p>
     <w:p>
@@ -610,7 +610,17 @@
         <w:rPr>
           <w:b w:val="0"/>
         </w:rPr>
-        <w:t>Все команды PowerShell выполняются в Windows, а команды Bash — в терминале Ubuntu внутри WSL. Для работы с файлом образа USB-перенаправление и usbipd не нужны.</w:t>
+        <w:t>В PowerShell от имени администратора проверьте установленную Ubuntu и версию WSL:</w:t>
+      </w:r>
+    </w:p>
+    <w:p>
+      <w:pPr>
+        <w:pStyle w:val="Commands"/>
+      </w:pPr>
+      <w:r>
+        <w:t>wsl --list --verbose</w:t>
+        <w:br/>
+        <w:t>wsl --update</w:t>
       </w:r>
     </w:p>
     <w:p>
@@ -618,7 +628,7 @@
         <w:rPr>
           <w:b w:val="0"/>
         </w:rPr>
-        <w:t>Откройте PowerShell от имени администратора. Если Ubuntu в WSL еще не установлена, выполните команду и завершите первоначальную настройку пользователя Ubuntu. При запросе перезагрузите Windows.</w:t>
+        <w:t>Если Ubuntu еще не установлена, выполните команду ниже, перезагрузите Windows при необходимости и завершите первоначальную настройку пользователя Ubuntu:</w:t>
       </w:r>
     </w:p>
     <w:p>
@@ -634,25 +644,7 @@
         <w:rPr>
           <w:b w:val="0"/>
         </w:rPr>
-        <w:t>Обновите WSL и проверьте список дистрибутивов. В столбце VERSION у Ubuntu должно быть значение 2.</w:t>
-      </w:r>
-    </w:p>
-    <w:p>
-      <w:pPr>
-        <w:pStyle w:val="Commands"/>
-      </w:pPr>
-      <w:r>
-        <w:t>wsl --update</w:t>
-        <w:br/>
-        <w:t>wsl --list --verbose</w:t>
-      </w:r>
-    </w:p>
-    <w:p>
-      <w:r>
-        <w:rPr>
-          <w:b w:val="0"/>
-        </w:rPr>
-        <w:t>Если у установленной Ubuntu указана версия 1, переведите ее в WSL 2. Вместо Ubuntu используйте точное имя из списка, если оно отличается.</w:t>
+        <w:t>У дистрибутива Ubuntu должна быть версия 2. Если указана версия 1, преобразуйте его, указав точное имя из списка:</w:t>
       </w:r>
     </w:p>
     <w:p>
@@ -668,7 +660,7 @@
         <w:pStyle w:val="Heading1"/>
       </w:pPr>
       <w:r>
-        <w:t>2 Открытие образа на диске D</w:t>
+        <w:t>2 Подключение образа на месте</w:t>
       </w:r>
     </w:p>
     <w:p>
@@ -676,7 +668,7 @@
         <w:rPr>
           <w:b w:val="0"/>
         </w:rPr>
-        <w:t>Откройте Ubuntu. Следующие шаги до отключения образа выполняйте в одном и том же терминале, чтобы сохранить переменные ff_image и ff_loop. Закройте Etcher и другие программы, которые могут использовать этот образ.</w:t>
+        <w:t>Закройте HDD Raw Copy Tool и все программы, работающие с образом. Откройте Ubuntu и выполняйте последующие команды в одном терминале. При ошибке остановитесь и устраните ее перед продолжением.</w:t>
       </w:r>
     </w:p>
     <w:p>
@@ -696,15 +688,7 @@
         <w:rPr>
           <w:b w:val="0"/>
         </w:rPr>
-        <w:t>Команда ls должна показать существующий файл. Последняя команда не должна вывести ни одного loop-устройства. Если образ уже подключен, сначала корректно отключите прежнее подключение. При любой ошибке остановитесь и устраните ее перед следующим шагом.</w:t>
-      </w:r>
-    </w:p>
-    <w:p>
-      <w:r>
-        <w:rPr>
-          <w:b w:val="0"/>
-        </w:rPr>
-        <w:t>Подключите образ как виртуальный диск и выведите его разделы:</w:t>
+        <w:t>Файл должен существовать, а последняя команда не должна вывести ни одного подключения. Имеющееся подключение сначала корректно отключите. Затем создайте loop-устройство:</w:t>
       </w:r>
     </w:p>
     <w:p>
@@ -724,23 +708,7 @@
         <w:rPr>
           <w:b w:val="0"/>
         </w:rPr>
-        <w:t>Ожидается имя вида /dev/loop0 и список разделов, например loop0p1. Найдите корневой раздел Ubuntu с файловой системой ext4. Номер раздела нужно взять из вывода команды; это может быть p1, p2 или другой номер.</w:t>
-      </w:r>
-    </w:p>
-    <w:p>
-      <w:pPr>
-        <w:pStyle w:val="Heading1"/>
-      </w:pPr>
-      <w:r>
-        <w:t>3 Подключение корневого раздела</w:t>
-      </w:r>
-    </w:p>
-    <w:p>
-      <w:r>
-        <w:rPr>
-          <w:b w:val="0"/>
-        </w:rPr>
-        <w:t>В следующей команде p1 — пример. Замените p1 на номер найденного корневого раздела.</w:t>
+        <w:t>Найдите корневой раздел Ubuntu с ext4. Номер p1 ниже — только пример; замените его фактическим номером из lsblk. ff_loop должен содержать имя вида /dev/loop0, а не пустую строку.</w:t>
       </w:r>
     </w:p>
     <w:p>
@@ -760,7 +728,7 @@
         <w:rPr>
           <w:b w:val="0"/>
         </w:rPr>
-        <w:t>В корневом разделе должны быть каталоги etc, opt и var. Если их нет, отключите этот раздел командой sudo umount /mnt/fuelflux-image и выберите другой раздел образа.</w:t>
+        <w:t>В разделе должны быть etc, opt и var. Если их нет, выполните sudo umount /mnt/fuelflux-image и выберите правильный раздел. Не выбирайте устройства /dev/sdX наугад.</w:t>
       </w:r>
     </w:p>
     <w:p>
@@ -773,7 +741,7 @@
         <w:pStyle w:val="Heading1"/>
       </w:pPr>
       <w:r>
-        <w:t>4 Настройка ID контроллера</w:t>
+        <w:t>3 Настройка ID и адреса API</w:t>
       </w:r>
     </w:p>
     <w:p>
@@ -781,7 +749,7 @@
         <w:rPr>
           <w:b w:val="0"/>
         </w:rPr>
-        <w:t>Убедитесь, что необходимые конфигурационные файлы существуют:</w:t>
+        <w:t>Проверьте установленный файл конфигурации и откройте его:</w:t>
       </w:r>
     </w:p>
     <w:p>
@@ -791,30 +759,6 @@
       <w:r>
         <w:t>sudo ls -l /mnt/fuelflux-image/etc/fuelflux/fuelflux.env</w:t>
         <w:br/>
-        <w:t>sudo ls -l /mnt/fuelflux-image/etc/systemd/system/autossh-ppp.service</w:t>
-      </w:r>
-    </w:p>
-    <w:p>
-      <w:r>
-        <w:rPr>
-          <w:b w:val="0"/>
-        </w:rPr>
-        <w:t>Если файл отсутствует, проверьте выбранный раздел и установку пакетов. Не создавайте пустой файл службы вместо отсутствующего установленного файла.</w:t>
-      </w:r>
-    </w:p>
-    <w:p>
-      <w:r>
-        <w:rPr>
-          <w:b w:val="0"/>
-        </w:rPr>
-        <w:t>Откройте конфигурацию FuelFlux:</w:t>
-      </w:r>
-    </w:p>
-    <w:p>
-      <w:pPr>
-        <w:pStyle w:val="Commands"/>
-      </w:pPr>
-      <w:r>
         <w:t>sudo nano /mnt/fuelflux-image/etc/fuelflux/fuelflux.env</w:t>
       </w:r>
     </w:p>
@@ -823,7 +767,7 @@
         <w:rPr>
           <w:b w:val="0"/>
         </w:rPr>
-        <w:t>Найдите FUELFLUX_CONTROLLER_ID. Измените существующую активную строку либо уберите # перед закомментированным примером. Если такой строки нет, добавьте ее. Оставьте ровно одну активную строку с назначенным ID:</w:t>
+        <w:t>Сохраните остальные настройки. Добавьте или измените ровно по одной активной строке каждого параметра. Пример для устройства 1 с сервером по умолчанию:</w:t>
       </w:r>
     </w:p>
     <w:p>
@@ -832,6 +776,8 @@
       </w:pPr>
       <w:r>
         <w:t>FUELFLUX_CONTROLLER_ID=232390330480220</w:t>
+        <w:br/>
+        <w:t>FUELFLUX_BACKEND_URL=http://ttft.uxp.ru</w:t>
       </w:r>
     </w:p>
     <w:p>
@@ -839,7 +785,68 @@
         <w:rPr>
           <w:b w:val="0"/>
         </w:rPr>
-        <w:t>Значение выше соответствует устройству 1 в таблице. Сохраните остальные параметры файла. В Nano нажмите Ctrl+O, затем Enter для сохранения и Ctrl+X для выхода.</w:t>
+        <w:t>Чтобы использовать другой сервер, замените вторую строку. Допустимы HTTP и HTTPS, имя или IP сервера, необязательные порт и базовый путь:</w:t>
+      </w:r>
+    </w:p>
+    <w:p>
+      <w:pPr>
+        <w:pStyle w:val="Commands"/>
+      </w:pPr>
+      <w:r>
+        <w:t>FUELFLUX_BACKEND_URL=https://api.example.org:8443/fleet</w:t>
+      </w:r>
+    </w:p>
+    <w:p>
+      <w:r>
+        <w:rPr>
+          <w:b w:val="0"/>
+        </w:rPr>
+        <w:t>Адрес должен указывать на базу API: приложение добавляет к нему /api/pump/authorize и другие пути. Для примера выше запрос идет на https://api.example.org:8443/fleet/api/pump/authorize. Проверьте, что сервер обслуживает такой префикс. Не добавляйте /api/pump/authorize в значение переменной.</w:t>
+      </w:r>
+    </w:p>
+    <w:p>
+      <w:pPr>
+        <w:pStyle w:val="Heading2"/>
+      </w:pPr>
+      <w:r>
+        <w:t>Правила применения настроек</w:t>
+      </w:r>
+    </w:p>
+    <w:p>
+      <w:r>
+        <w:rPr>
+          <w:b w:val="0"/>
+        </w:rPr>
+        <w:t>Отсутствующий, пустой или состоящий только из пробелов ID означает 232390330480219; аналогичный URL означает http://ttft.uxp.ru. Пробелы по краям значений удаляются, ведущие нули ID сохраняются. Завершающие слеши URL удаляются.</w:t>
+      </w:r>
+    </w:p>
+    <w:p>
+      <w:r>
+        <w:rPr>
+          <w:b w:val="0"/>
+        </w:rPr>
+        <w:t>URL с логином или паролем, запросом после ?, фрагментом после #, неверным портом или синтаксисом отклоняется. Приложение один раз выводит предупреждение и использует встроенный http://ttft.uxp.ru, сохраняя допустимый ID. Отклоненное значение в журнал не попадает. Обычная ошибка связи не переключает сервер.</w:t>
+      </w:r>
+    </w:p>
+    <w:p>
+      <w:r>
+        <w:rPr>
+          <w:b w:val="0"/>
+        </w:rPr>
+        <w:t>Настройки читаются один раз при запуске и одинаково используются основными запросами, синхронизацией кэша и доставкой очереди. Они сохраняются при внутренних повторных попытках приложения. Проверка фактически примененных значений приведена в шаге 9.</w:t>
+      </w:r>
+    </w:p>
+    <w:p>
+      <w:r>
+        <w:rPr>
+          <w:b w:val="0"/>
+        </w:rPr>
+        <w:t>В Nano сохраните файл сочетанием Ctrl+O, Enter и выйдите через Ctrl+X. Редактирование отключенного образа не требует запуска systemctl внутри WSL.</w:t>
+      </w:r>
+    </w:p>
+    <w:p>
+      <w:r>
+        <w:br w:type="page"/>
       </w:r>
     </w:p>
     <w:p>
@@ -847,7 +854,7 @@
         <w:pStyle w:val="Heading1"/>
       </w:pPr>
       <w:r>
-        <w:t>5 Настройка удаленного SSH порта</w:t>
+        <w:t>4 Назначение удаленного SSH порта</w:t>
       </w:r>
     </w:p>
     <w:p>
@@ -855,7 +862,7 @@
         <w:rPr>
           <w:b w:val="0"/>
         </w:rPr>
-        <w:t>Откройте установленную службу туннеля:</w:t>
+        <w:t>Настройка туннеля относится к установленному fuelflux.srv. Откройте существующую службу. Если ее нет, проверьте раздел и установку пакета; не создавайте вместо нее пустой файл.</w:t>
       </w:r>
     </w:p>
     <w:p>
@@ -863,7 +870,9 @@
         <w:pStyle w:val="Commands"/>
       </w:pPr>
       <w:r>
-        <w:t>sudo nano /mnt/fuelflux-image/etc/systemd/system/autossh-ppp.service</w:t>
+        <w:t>sudo nano \</w:t>
+        <w:br/>
+        <w:t xml:space="preserve">  /mnt/fuelflux-image/etc/systemd/system/autossh-ppp.service</w:t>
       </w:r>
     </w:p>
     <w:p>
@@ -871,7 +880,7 @@
         <w:rPr>
           <w:b w:val="0"/>
         </w:rPr>
-        <w:t>В команде ExecStart найдите аргумент обратного туннеля. Исходный фрагмент:</w:t>
+        <w:t>В ExecStart найдите аргумент -R. Исходный порт в вашем образе — 8088. Для устройства 1 измените фрагмент следующим образом:</w:t>
       </w:r>
     </w:p>
     <w:p>
@@ -880,21 +889,10 @@
       </w:pPr>
       <w:r>
         <w:t>-R 8088:localhost:22</w:t>
-      </w:r>
-    </w:p>
-    <w:p>
-      <w:r>
-        <w:rPr>
-          <w:b w:val="0"/>
-        </w:rPr>
-        <w:t>Для первого устройства замените его на:</w:t>
-      </w:r>
-    </w:p>
-    <w:p>
-      <w:pPr>
-        <w:pStyle w:val="Commands"/>
-      </w:pPr>
-      <w:r>
+        <w:br/>
+        <w:br/>
+        <w:t># После изменения</w:t>
+        <w:br/>
         <w:t>-R 22001:localhost:22</w:t>
       </w:r>
     </w:p>
@@ -903,7 +901,15 @@
         <w:rPr>
           <w:b w:val="0"/>
         </w:rPr>
-        <w:t>22001 — порт на удаленном сервере, а 22 — локальный SSH-порт Orange Pi. Измените только первое число. Сохраните localhost, локальный порт, адрес SSH-сервера user@host и символы продолжения строк \ в конце строк службы.</w:t>
+        <w:t>Меняется только первое число — порт на удаленном сервере. Сохраните localhost, локальный порт 22, адрес SSH-сервера user@host, остальные аргументы и символы продолжения строк \. Для следующей карты замените уже установленный 22001 на 22002, затем на 22003 и далее.</w:t>
+      </w:r>
+    </w:p>
+    <w:p>
+      <w:pPr>
+        <w:pStyle w:val="Heading2"/>
+      </w:pPr>
+      <w:r>
+        <w:t>Разрешение портов на удаленном сервере</w:t>
       </w:r>
     </w:p>
     <w:p>
@@ -911,15 +917,7 @@
         <w:rPr>
           <w:b w:val="0"/>
         </w:rPr>
-        <w:t>Сохраните файл через Ctrl+O, Enter, Ctrl+X. Для следующего устройства заменяйте уже установленный порт 22001 на 22002, затем 22003 и далее. Поиск только исходного 8088 при повторных проходах не подойдет.</w:t>
-      </w:r>
-    </w:p>
-    <w:p>
-      <w:pPr>
-        <w:pStyle w:val="Heading1"/>
-      </w:pPr>
-      <w:r>
-        <w:t>6 Контроль сохраненных значений</w:t>
+        <w:t>Назначенный порт должен быть свободен и разрешен пользователю и ключу туннеля. Обычно обратный туннель слушает localhost удаленного сервера. Если authorized_keys содержит permitlisten для старого 8088, администратор должен разрешить соответствующий новый порт:</w:t>
       </w:r>
     </w:p>
     <w:p>
@@ -927,7 +925,31 @@
         <w:pStyle w:val="Commands"/>
       </w:pPr>
       <w:r>
-        <w:t>sudo grep -n '^FUELFLUX_CONTROLLER_ID=' \</w:t>
+        <w:t>permitlisten="localhost:22001"</w:t>
+      </w:r>
+    </w:p>
+    <w:p>
+      <w:r>
+        <w:rPr>
+          <w:b w:val="0"/>
+        </w:rPr>
+        <w:t>Это фрагмент строки ключа на сервере. Сохраните сам ключ и остальные ограничения. Для отдельных ключей разрешите каждому свой порт; для общего ключа должны быть разрешены все порты группы. Адрес SSH-сервера туннеля и URL API — независимые настройки.</w:t>
+      </w:r>
+    </w:p>
+    <w:p>
+      <w:pPr>
+        <w:pStyle w:val="Heading2"/>
+      </w:pPr>
+      <w:r>
+        <w:t>Контроль параметров образа</w:t>
+      </w:r>
+    </w:p>
+    <w:p>
+      <w:pPr>
+        <w:pStyle w:val="Commands"/>
+      </w:pPr>
+      <w:r>
+        <w:t>sudo grep -nE '^FUELFLUX_(CONTROLLER_ID|BACKEND_URL)=' \</w:t>
         <w:br/>
         <w:t xml:space="preserve">  /mnt/fuelflux-image/etc/fuelflux/fuelflux.env</w:t>
         <w:br/>
@@ -941,7 +963,7 @@
         <w:rPr>
           <w:b w:val="0"/>
         </w:rPr>
-        <w:t>Сверьте ID и порт с выбранной строкой таблицы. При редактировании отключенного образа выполнять systemctl daemon-reload или запускать службы внутри WSL не требуется.</w:t>
+        <w:t>Сверьте ID, URL и порт с журналом партии. На следующем проходе учитывайте значения, оставшиеся после предыдущего контроллера.</w:t>
       </w:r>
     </w:p>
     <w:p>
@@ -954,7 +976,7 @@
         <w:pStyle w:val="Heading1"/>
       </w:pPr>
       <w:r>
-        <w:t>7 Завершение редактирования образа</w:t>
+        <w:t>5 Загрузка исполняемого файла ARM64</w:t>
       </w:r>
     </w:p>
     <w:p>
@@ -962,7 +984,266 @@
         <w:rPr>
           <w:b w:val="0"/>
         </w:rPr>
-        <w:t>Закройте Nano и все окна, открывшие файлы подключенного раздела. В терминале WSL выполните:</w:t>
+        <w:t>Этот шаг нужен, если образ содержит прежнюю версию FuelFlux. Заменяется только бинарный файл внутри отключенного образа. Процедура обновления работающего устройства здесь не рассматривается.</w:t>
+      </w:r>
+    </w:p>
+    <w:p>
+      <w:r>
+        <w:rPr>
+          <w:b w:val="0"/>
+        </w:rPr>
+        <w:t>На странице релиза FuelFlux выберите согласованную версию, собранную для Ubuntu 22.04 ARM64 с нужным оборудованием. Скачайте отдельный исполняемый файл и SHA256SUMS из одного релиза. Файл .deb для этой операции не нужен. Пример имени для версии 0.3.9: fuelflux_0.3.9_arm64. Наличие релиза нужно проверить на странице Releases.</w:t>
+      </w:r>
+    </w:p>
+    <w:p>
+      <w:hyperlink r:id="rId10">
+        <w:r>
+          <w:rPr>
+            <w:color w:val="000000"/>
+            <w:u w:val="single"/>
+          </w:rPr>
+          <w:t>FuelFlux Releases</w:t>
+        </w:r>
+      </w:hyperlink>
+    </w:p>
+    <w:p>
+      <w:r>
+        <w:rPr>
+          <w:b w:val="0"/>
+        </w:rPr>
+        <w:t>Поместите оба файла в D:\images\releases\v0.3.9. Если выбрана другая версия, измените путь и ff_name в командах. Образ остается подключенным из шага 2.</w:t>
+      </w:r>
+    </w:p>
+    <w:p>
+      <w:pPr>
+        <w:pStyle w:val="Commands"/>
+      </w:pPr>
+      <w:r>
+        <w:t>cd /mnt/d/images/releases/v0.3.9</w:t>
+        <w:br/>
+        <w:t>ff_name='fuelflux_0.3.9_arm64'</w:t>
+        <w:br/>
+        <w:t>test -s "$ff_name" &amp;&amp; test -s SHA256SUMS</w:t>
+      </w:r>
+    </w:p>
+    <w:p>
+      <w:r>
+        <w:rPr>
+          <w:b w:val="0"/>
+        </w:rPr>
+        <w:t>Извлеките из общего манифеста строку именно исполняемого файла и проверьте SHA256. Команды должны завершиться без ошибок, а проверка — вывести OK. При несовпадении не продолжайте.</w:t>
+      </w:r>
+    </w:p>
+    <w:p>
+      <w:pPr>
+        <w:pStyle w:val="Commands"/>
+      </w:pPr>
+      <w:r>
+        <w:t>ff_expected=$(awk -v name="$ff_name" \</w:t>
+        <w:br/>
+        <w:t xml:space="preserve">  '$2 == name {print $1}' SHA256SUMS)</w:t>
+        <w:br/>
+        <w:t>test "${#ff_expected}" -eq 64</w:t>
+        <w:br/>
+        <w:t>printf '%s  %s\n' "$ff_expected" "$ff_name" | \</w:t>
+        <w:br/>
+        <w:t xml:space="preserve">  sha256sum --check --strict</w:t>
+      </w:r>
+    </w:p>
+    <w:p>
+      <w:r>
+        <w:rPr>
+          <w:b w:val="0"/>
+        </w:rPr>
+        <w:t>Убедитесь, что скачан ELF для AArch64, а не x86-64, архив или HTML-страница ошибки:</w:t>
+      </w:r>
+    </w:p>
+    <w:p>
+      <w:pPr>
+        <w:pStyle w:val="Commands"/>
+      </w:pPr>
+      <w:r>
+        <w:t>file "$ff_name"</w:t>
+        <w:br/>
+        <w:t>readelf -h "$ff_name" | grep Machine</w:t>
+        <w:br/>
+        <w:t>readelf -d "$ff_name" | grep NEEDED</w:t>
+      </w:r>
+    </w:p>
+    <w:p>
+      <w:r>
+        <w:rPr>
+          <w:b w:val="0"/>
+        </w:rPr>
+        <w:t>В Machine должно быть AArch64. Утилиты file, readelf и sha256sum анализируют файл и не запускают его. При необходимости установите в Ubuntu пакеты file, binutils и coreutils. Не запускайте ARM64 файл, chroot или ldd внутри обычной x64 WSL. Зависимости проверяйте по пакету той же версии и на целевом Orange Pi.</w:t>
+      </w:r>
+    </w:p>
+    <w:p>
+      <w:r>
+        <w:rPr>
+          <w:b w:val="0"/>
+        </w:rPr>
+        <w:t>Отдельный файл и файл в .deb имеют одинаковые байты и проверяются процессом сборки. Отдельный файл сам не устанавливает библиотеки: до записи карты убедитесь, что чистый образ содержит зависимости пакета этой версии, включая libc-ares2 и libfreetype6.</w:t>
+      </w:r>
+    </w:p>
+    <w:p>
+      <w:r>
+        <w:br w:type="page"/>
+      </w:r>
+    </w:p>
+    <w:p>
+      <w:pPr>
+        <w:pStyle w:val="Heading1"/>
+      </w:pPr>
+      <w:r>
+        <w:t>6 Замена бинарного файла внутри образа</w:t>
+      </w:r>
+    </w:p>
+    <w:p>
+      <w:r>
+        <w:rPr>
+          <w:b w:val="0"/>
+        </w:rPr>
+        <w:t>Продолжайте в том же терминале WSL и каталоге скачанного релиза, после успешной проверки SHA256. Корневой раздел образа должен оставаться подключенным. Задайте путь и убедитесь, что прежний файл существует:</w:t>
+      </w:r>
+    </w:p>
+    <w:p>
+      <w:pPr>
+        <w:pStyle w:val="Commands"/>
+      </w:pPr>
+      <w:r>
+        <w:t>ff_bin=/mnt/fuelflux-image/opt/fuelflux/bin</w:t>
+        <w:br/>
+        <w:t>sudo test -f "$ff_bin/fuelflux"</w:t>
+        <w:br/>
+        <w:t>sudo ls -l "$ff_bin/fuelflux"</w:t>
+      </w:r>
+    </w:p>
+    <w:p>
+      <w:r>
+        <w:rPr>
+          <w:b w:val="0"/>
+        </w:rPr>
+        <w:t>Сохраните прежний бинарный файл для отката. Эта небольшая резервная копия относится только к программе; полный образ не копируется. Запишите фактическое имя копии в журнал партии.</w:t>
+      </w:r>
+    </w:p>
+    <w:p>
+      <w:pPr>
+        <w:pStyle w:val="Commands"/>
+      </w:pPr>
+      <w:r>
+        <w:t>ff_backup="fuelflux.previous.$(date +%Y%m%d-%H%M%S)"</w:t>
+        <w:br/>
+        <w:t>sudo cp -p -- "$ff_bin/fuelflux" "$ff_bin/$ff_backup"</w:t>
+        <w:br/>
+        <w:t>printf '%s\n' "$ff_backup"</w:t>
+      </w:r>
+    </w:p>
+    <w:p>
+      <w:r>
+        <w:rPr>
+          <w:b w:val="0"/>
+        </w:rPr>
+        <w:t>Сначала создайте временный файл в том же каталоге. Назначьте владельца root:root, режим 0755 и сравните байты с проверенным файлом:</w:t>
+      </w:r>
+    </w:p>
+    <w:p>
+      <w:pPr>
+        <w:pStyle w:val="Commands"/>
+      </w:pPr>
+      <w:r>
+        <w:t>sudo install -o root -g root -m 0755 -- \</w:t>
+        <w:br/>
+        <w:t xml:space="preserve">  "$ff_name" "$ff_bin/fuelflux.new"</w:t>
+        <w:br/>
+        <w:t>sudo cmp -- "$ff_name" "$ff_bin/fuelflux.new"</w:t>
+        <w:br/>
+        <w:t>sudo stat -c '%U:%G %a %n' "$ff_bin/fuelflux.new"</w:t>
+      </w:r>
+    </w:p>
+    <w:p>
+      <w:r>
+        <w:rPr>
+          <w:b w:val="0"/>
+        </w:rPr>
+        <w:t>Ожидается root:root 755. Только после успешного сравнения переименуйте подготовленный файл на место программы:</w:t>
+      </w:r>
+    </w:p>
+    <w:p>
+      <w:pPr>
+        <w:pStyle w:val="Commands"/>
+      </w:pPr>
+      <w:r>
+        <w:t>sudo mv -f -- "$ff_bin/fuelflux.new" "$ff_bin/fuelflux"</w:t>
+        <w:br/>
+        <w:t>sudo cmp -- "$ff_name" "$ff_bin/fuelflux"</w:t>
+        <w:br/>
+        <w:t>sudo sha256sum "$ff_bin/fuelflux"</w:t>
+      </w:r>
+    </w:p>
+    <w:p>
+      <w:r>
+        <w:rPr>
+          <w:b w:val="0"/>
+        </w:rPr>
+        <w:t>Проверьте итоговую сумму по ff_expected. Сохраняйте /etc/fuelflux, /var/fuelflux и все базы данных. Замена бинарного файла не требует удаления кэша или очереди и не меняет ID и URL.</w:t>
+      </w:r>
+    </w:p>
+    <w:p>
+      <w:pPr>
+        <w:pStyle w:val="Heading2"/>
+      </w:pPr>
+      <w:r>
+        <w:t>Откат внутри отключенного образа</w:t>
+      </w:r>
+    </w:p>
+    <w:p>
+      <w:r>
+        <w:rPr>
+          <w:b w:val="0"/>
+        </w:rPr>
+        <w:t>При необходимости используйте сохраненную копию. Если терминал был закрыт, заново подключите образ и задайте ff_bin и точное имя ff_backup из журнала.</w:t>
+      </w:r>
+    </w:p>
+    <w:p>
+      <w:pPr>
+        <w:pStyle w:val="Commands"/>
+      </w:pPr>
+      <w:r>
+        <w:t>sudo install -o root -g root -m 0755 -- \</w:t>
+        <w:br/>
+        <w:t xml:space="preserve">  "$ff_bin/$ff_backup" "$ff_bin/fuelflux.rollback"</w:t>
+        <w:br/>
+        <w:t>sudo mv -f -- "$ff_bin/fuelflux.rollback" "$ff_bin/fuelflux"</w:t>
+      </w:r>
+    </w:p>
+    <w:p>
+      <w:r>
+        <w:rPr>
+          <w:b w:val="0"/>
+        </w:rPr>
+        <w:t>Не удаляйте резервный файл до успешной приемки версии. На каждой стадии останавливайтесь при ошибке; не переименовывайте непроверенный файл.</w:t>
+      </w:r>
+    </w:p>
+    <w:p>
+      <w:r>
+        <w:br w:type="page"/>
+      </w:r>
+    </w:p>
+    <w:p>
+      <w:pPr>
+        <w:pStyle w:val="Heading1"/>
+      </w:pPr>
+      <w:r>
+        <w:t>7 Отключение образа перед записью</w:t>
+      </w:r>
+    </w:p>
+    <w:p>
+      <w:r>
+        <w:rPr>
+          <w:b w:val="0"/>
+        </w:rPr>
+        <w:t>Закройте редакторы и окна, использующие подключенный раздел. В терминале WSL выполните:</w:t>
       </w:r>
     </w:p>
     <w:p>
@@ -982,7 +1263,7 @@
         <w:rPr>
           <w:b w:val="0"/>
         </w:rPr>
-        <w:t>Только после успешного umount отключите виртуальный диск:</w:t>
+        <w:t>Только после успешного umount отключите loop-устройство:</w:t>
       </w:r>
     </w:p>
     <w:p>
@@ -1000,7 +1281,7 @@
         <w:rPr>
           <w:b/>
         </w:rPr>
-        <w:t>Последняя команда не должна вывести подключений. Измененный файл уже находится по адресу D:\images\fuelflux.img; копировать или экспортировать его не нужно.</w:t>
+        <w:t>Последняя команда не должна показывать подключений. Изменения уже находятся в D:\images\fuelflux.img. Копирование и экспорт не нужны.</w:t>
       </w:r>
     </w:p>
     <w:p>
@@ -1008,7 +1289,7 @@
         <w:rPr>
           <w:b w:val="0"/>
         </w:rPr>
-        <w:t>Если umount сообщает target is busy, закройте редакторы и окна проводника, перейдите командой cd ~ за пределы раздела и повторите отключение. Не используйте принудительное или отложенное отключение перед прошивкой.</w:t>
+        <w:t>Если раздел занят, закройте программы, выйдите из его каталогов командой cd ~ и повторите umount. Не используйте принудительное или отложенное отключение перед записью карты.</w:t>
       </w:r>
     </w:p>
     <w:p>
@@ -1016,7 +1297,7 @@
         <w:pStyle w:val="Heading1"/>
       </w:pPr>
       <w:r>
-        <w:t>8 Запись карты через balenaEtcher</w:t>
+        <w:t>8 Запись карты через HDD Raw Copy Tool</w:t>
       </w:r>
     </w:p>
     <w:p>
@@ -1024,15 +1305,7 @@
         <w:rPr>
           <w:b w:val="0"/>
         </w:rPr>
-        <w:t>Подключите целевую карту через картридер. Если Windows предлагает форматирование, отмените его. Емкость карты в байтах должна быть не меньше размера несжатого образа; номинально одинаковые карты могут немного отличаться.</w:t>
-      </w:r>
-    </w:p>
-    <w:p>
-      <w:r>
-        <w:rPr>
-          <w:b w:val="0"/>
-        </w:rPr>
-        <w:t>В balenaEtcher последовательно выполните следующие действия:</w:t>
+        <w:t>Подключите карту через картридер. Отмените предложения Windows отформатировать Linux-разделы. Реальная емкость носителя в байтах должна вмещать весь образ, включая свободное место; одинаковая маркировка карт не гарантирует одинаковый размер.</w:t>
       </w:r>
     </w:p>
     <w:p>
@@ -1040,7 +1313,7 @@
         <w:pStyle w:val="ListNumber"/>
       </w:pPr>
       <w:r>
-        <w:t>Нажмите Flash from file и выберите D:\images\fuelflux.img.</w:t>
+        <w:t>Запустите HDD Raw Copy Tool от имени администратора.</w:t>
       </w:r>
     </w:p>
     <w:p>
@@ -1048,7 +1321,7 @@
         <w:pStyle w:val="ListNumber"/>
       </w:pPr>
       <w:r>
-        <w:t>Нажмите Select target и выберите карту по модели и емкости. Проверьте, что выбран именно целевой носитель.</w:t>
+        <w:t>Выберите FILE как источник и откройте D:\images\fuelflux.img.</w:t>
       </w:r>
     </w:p>
     <w:p>
@@ -1056,7 +1329,7 @@
         <w:pStyle w:val="ListNumber"/>
       </w:pPr>
       <w:r>
-        <w:t>Нажмите Flash и дождитесь завершения записи и проверки.</w:t>
+        <w:t>Выберите физическую карту как назначение. Сверьте модель и фактическую емкость; не ориентируйтесь только на букву диска.</w:t>
       </w:r>
     </w:p>
     <w:p>
@@ -1064,7 +1337,31 @@
         <w:pStyle w:val="ListNumber"/>
       </w:pPr>
       <w:r>
-        <w:t>После успешного завершения безопасно извлеките карту. Подпишите ее назначенным ID и портом.</w:t>
+        <w:t>Запустите запись и подтвердите предупреждение о полной перезаписи содержимого назначения.</w:t>
+      </w:r>
+    </w:p>
+    <w:p>
+      <w:pPr>
+        <w:pStyle w:val="ListNumber"/>
+      </w:pPr>
+      <w:r>
+        <w:t>Дождитесь успешного завершения и проверьте журнал операции на ошибки чтения или записи. При ошибках карту не выпускайте.</w:t>
+      </w:r>
+    </w:p>
+    <w:p>
+      <w:pPr>
+        <w:pStyle w:val="ListNumber"/>
+      </w:pPr>
+      <w:r>
+        <w:t>Безопасно извлеките карту, подпишите ее ID и портом. Вставьте в Orange Pi и выполните приемку по шагу 9.</w:t>
+      </w:r>
+    </w:p>
+    <w:p>
+      <w:pPr>
+        <w:pStyle w:val="ListNumber"/>
+      </w:pPr>
+      <w:r>
+        <w:t>Закройте HDD Raw Copy Tool перед следующим подключением и редактированием того же файла образа.</w:t>
       </w:r>
     </w:p>
     <w:p>
@@ -1072,39 +1369,7 @@
         <w:rPr>
           <w:b/>
         </w:rPr>
-        <w:t>Запись полностью заменяет содержимое выбранной карты. Пока Etcher читает образ, не подключайте его в WSL и не меняйте его содержимое.</w:t>
-      </w:r>
-    </w:p>
-    <w:p>
-      <w:pPr>
-        <w:pStyle w:val="Heading1"/>
-      </w:pPr>
-      <w:r>
-        <w:t>9 Подготовка следующего устройства</w:t>
-      </w:r>
-    </w:p>
-    <w:p>
-      <w:r>
-        <w:rPr>
-          <w:b w:val="0"/>
-        </w:rPr>
-        <w:t>После завершения записи и закрытия Etcher повторите шаги 2–8 с тем же файлом D:\images\fuelflux.img. Измените ID и порт на значения следующего устройства. Подключение loop-устройства выполняется заново в каждом цикле.</w:t>
-      </w:r>
-    </w:p>
-    <w:p>
-      <w:r>
-        <w:rPr>
-          <w:b w:val="0"/>
-        </w:rPr>
-        <w:t>Пример последовательности: устройство 1 — ID 232390330480220 и порт 22001; устройство 2 — ID 232390330480221 и порт 22002; далее по таблице. Каждую карту прошивайте до изменения параметров для следующего устройства.</w:t>
-      </w:r>
-    </w:p>
-    <w:p>
-      <w:r>
-        <w:rPr>
-          <w:b w:val="0"/>
-        </w:rPr>
-        <w:t>После пятого прохода общий файл будет содержать настройки устройства 5. Уже прошитые карты сохранят свои индивидуальные настройки. В журнале партии запишите ID, порт, маркировку карты и результат проверки каждого устройства.</w:t>
+        <w:t>Пока программа читает образ, не подключайте его через WSL и не меняйте файл. Сначала проверьте одну карту, затем продолжайте всю партию.</w:t>
       </w:r>
     </w:p>
     <w:p>
@@ -1117,7 +1382,7 @@
         <w:pStyle w:val="Heading1"/>
       </w:pPr>
       <w:r>
-        <w:t>10 Подготовка удаленного сервера</w:t>
+        <w:t>9 Проверка устройства и следующая карта</w:t>
       </w:r>
     </w:p>
     <w:p>
@@ -1125,55 +1390,7 @@
         <w:rPr>
           <w:b w:val="0"/>
         </w:rPr>
-        <w:t>На удаленном SSH-сервере проверьте, что назначенный порт свободен и разрешен для данного ключа и пользователя. По умолчанию обратный туннель слушает localhost удаленного сервера.</w:t>
-      </w:r>
-    </w:p>
-    <w:p>
-      <w:r>
-        <w:rPr>
-          <w:b w:val="0"/>
-        </w:rPr>
-        <w:t>Если в authorized_keys ключ ограничен параметром permitlisten, замените разрешение для старого порта 8088 на назначенный порт, например:</w:t>
-      </w:r>
-    </w:p>
-    <w:p>
-      <w:pPr>
-        <w:pStyle w:val="Commands"/>
-      </w:pPr>
-      <w:r>
-        <w:t>permitlisten="localhost:22001"</w:t>
-      </w:r>
-    </w:p>
-    <w:p>
-      <w:r>
-        <w:rPr>
-          <w:b w:val="0"/>
-        </w:rPr>
-        <w:t>Это фрагмент существующей строки ключа. Сохраните остальные ограничения и сам публичный ключ. При отдельных ключах настройте каждому свой порт. Если один ключ обслуживает несколько контроллеров, его ограничения должны разрешать все назначенные порты этой группы.</w:t>
-      </w:r>
-    </w:p>
-    <w:p>
-      <w:r>
-        <w:rPr>
-          <w:b w:val="0"/>
-        </w:rPr>
-        <w:t>Изменение permitlisten выполняется на удаленном сервере, а не в файле службы Orange Pi. При отсутствии прав на сервер передайте администратору список устройств и портов.</w:t>
-      </w:r>
-    </w:p>
-    <w:p>
-      <w:pPr>
-        <w:pStyle w:val="Heading1"/>
-      </w:pPr>
-      <w:r>
-        <w:t>11 Проверка Orange Pi после записи</w:t>
-      </w:r>
-    </w:p>
-    <w:p>
-      <w:r>
-        <w:rPr>
-          <w:b w:val="0"/>
-        </w:rPr>
-        <w:t>Вставьте подготовленную карту, включите Orange Pi и дождитесь подключения PPP и SSH-туннеля. При первом запуске для проверки используйте локальную консоль или доступ по локальной сети.</w:t>
+        <w:t>Загрузите Orange Pi с подготовленной карты. Для первой проверки используйте локальную консоль или локальную сеть. Дождитесь PPP и подключения туннеля.</w:t>
       </w:r>
     </w:p>
     <w:p>
@@ -1191,7 +1408,7 @@
         <w:rPr>
           <w:b w:val="0"/>
         </w:rPr>
-        <w:t>Убедитесь, что туннель установился без ошибок отказа в переадресации, аутентификации или занятого порта. Затем проверьте ID, фактически используемые приложением:</w:t>
+        <w:t>Проверьте примененные настройки и отсутствие предупреждения об отклоненном URL:</w:t>
       </w:r>
     </w:p>
     <w:p>
@@ -1201,7 +1418,7 @@
       <w:r>
         <w:t>sudo journalctl -u fuelflux -b --no-pager | \</w:t>
         <w:br/>
-        <w:t xml:space="preserve">  grep -E 'Initializing controller:|Backend initialized'</w:t>
+        <w:t xml:space="preserve">  grep -E 'Effective FuelFlux settings:|Backend initialized|Invalid FUELFLUX_BACKEND_URL'</w:t>
       </w:r>
     </w:p>
     <w:p>
@@ -1209,15 +1426,17 @@
         <w:rPr>
           <w:b w:val="0"/>
         </w:rPr>
-        <w:t>ID в строке Initializing controller и во всех строках Backend initialized должен совпадать с назначенным ID. Дополнительно проверьте поступление запросов и данных от этого ID на сервере FuelFlux.</w:t>
+        <w:t>В Effective FuelFlux settings должны быть назначенный ID и нормализованный URL. Все строки Backend initialized должны показывать тот же ID и URL для основных запросов, кэша и очереди. Неверный URL с откатом на встроенный сервер означает, что настройку нужно исправить до приемки.</w:t>
       </w:r>
     </w:p>
     <w:p>
+      <w:pPr>
+        <w:pStyle w:val="Commands"/>
+      </w:pPr>
       <w:r>
-        <w:rPr>
-          <w:b/>
-        </w:rPr>
-        <w:t>Если основной Backend сообщает прежний ID, устройство не проходит приемку. Установите версию FuelFlux, в которой назначенный ID передается во все API-клиенты, и повторите проверку. Успешное редактирование env-файла не устраняет эту особенность текущего кода.</w:t>
+        <w:t>ldd /opt/fuelflux/bin/fuelflux</w:t>
+        <w:br/>
+        <w:t>sha256sum /opt/fuelflux/bin/fuelflux</w:t>
       </w:r>
     </w:p>
     <w:p>
@@ -1225,7 +1444,15 @@
         <w:rPr>
           <w:b w:val="0"/>
         </w:rPr>
-        <w:t>На самом удаленном SSH-сервере проверьте вход на Orange Pi через новый порт:</w:t>
+        <w:t>Эти команды выполняются на Orange Pi. В ldd не должно быть not found; SHA256 должен совпасть с релизом. Подтвердите на нужном сервере прием запросов от назначенного ID, синхронизацию кэша и доставку очереди, если она есть.</w:t>
+      </w:r>
+    </w:p>
+    <w:p>
+      <w:r>
+        <w:rPr>
+          <w:b w:val="0"/>
+        </w:rPr>
+        <w:t>На самом удаленном SSH-сервере проверьте вход через туннель:</w:t>
       </w:r>
     </w:p>
     <w:p>
@@ -1241,7 +1468,7 @@
         <w:rPr>
           <w:b w:val="0"/>
         </w:rPr>
-        <w:t>Здесь orangepi — пример существующего пользователя на Orange Pi. Замените его на свою учетную запись; порт выбирайте по таблице. Выполнять эту команду на своем ПК с localhost вместо удаленного сервера нельзя.</w:t>
+        <w:t>orangepi — пример пользователя устройства. Подставьте свою учетную запись и назначенный порт. Здесь localhost относится к удаленному серверу, где открывается туннель.</w:t>
       </w:r>
     </w:p>
     <w:p>
@@ -1249,7 +1476,31 @@
         <w:rPr>
           <w:b w:val="0"/>
         </w:rPr>
-        <w:t>Устройство считается настроенным, когда подтверждены назначенный ID во всех API-клиентах и на сервере, соединение через свой SSH-порт и отсутствие конфликтов с другими контроллерами партии. Для клонов также должны быть предусмотрены уникальные machine-id и SSH host keys; клиентские ключи туннеля должны быть авторизованы на сервере.</w:t>
+        <w:t>Перед выпуском обязательны проверка отказов оборудования и восстановления, совместной работы устройств I2C и измерение задержки остановки. Эта инструкция не заменяет аппаратную приемку.</w:t>
+      </w:r>
+    </w:p>
+    <w:p>
+      <w:pPr>
+        <w:pStyle w:val="Heading2"/>
+      </w:pPr>
+      <w:r>
+        <w:t>Подготовка следующего устройства</w:t>
+      </w:r>
+    </w:p>
+    <w:p>
+      <w:r>
+        <w:rPr>
+          <w:b w:val="0"/>
+        </w:rPr>
+        <w:t>После успешной записи и закрытия HDD Raw Copy Tool повторите шаги 2–8 с тем же образом: ID 232390330480221 и порт 22002 для второго, далее по таблице. В образе не появляются рабочие данные от загрузки записанной карты, если сам образ не использовался на устройстве. При смене сервера вновь подтвердите чистоту образа.</w:t>
+      </w:r>
+    </w:p>
+    <w:p>
+      <w:r>
+        <w:rPr>
+          <w:b w:val="0"/>
+        </w:rPr>
+        <w:t>Повторная замена уже проверенного бинарного файла не нужна. После пятой карты файл образа будет содержать параметры устройства 5. Каждая ранее записанная карта сохраняет свои параметры. Зафиксируйте результаты приемки, URL, версию, SHA256 и имя резервной копии программы.</w:t>
       </w:r>
     </w:p>
     <w:p>
@@ -1262,7 +1513,7 @@
         <w:pStyle w:val="Heading1"/>
       </w:pPr>
       <w:r>
-        <w:t>Устранение типовых затруднений</w:t>
+        <w:t>Устранение затруднений и источники</w:t>
       </w:r>
     </w:p>
     <w:p>
@@ -1271,14 +1522,6 @@
       </w:pPr>
       <w:r>
         <w:t>Не виден диск D в WSL</w:t>
-      </w:r>
-    </w:p>
-    <w:p>
-      <w:r>
-        <w:rPr>
-          <w:b w:val="0"/>
-        </w:rPr>
-        <w:t>Если каталог /mnt/d не подключен, выполните в Ubuntu следующие команды и снова проверьте существование образа. Папку images и сам файл заранее создают в Windows; команды ниже образ не создают.</w:t>
       </w:r>
     </w:p>
     <w:p>
@@ -1294,19 +1537,19 @@
       </w:r>
     </w:p>
     <w:p>
+      <w:r>
+        <w:rPr>
+          <w:b w:val="0"/>
+        </w:rPr>
+        <w:t>Эти команды не создают образ. Если файл не найден, проверьте Windows-путь и доступ. При ошибке losetup не продолжайте с пустым ff_loop.</w:t>
+      </w:r>
+    </w:p>
+    <w:p>
       <w:pPr>
         <w:pStyle w:val="Heading2"/>
       </w:pPr>
       <w:r>
-        <w:t>Не появились разделы образа</w:t>
-      </w:r>
-    </w:p>
-    <w:p>
-      <w:r>
-        <w:rPr>
-          <w:b w:val="0"/>
-        </w:rPr>
-        <w:t>Не выбирайте наугад устройства /dev/sdX или системный диск WSL. Проверьте, что ff_loop содержит имя loop-устройства, образ является несжатым полным образом диска и подключен с --partscan. Для диагностики выведите таблицу разделов:</w:t>
+        <w:t>Нет разделов loop устройства</w:t>
       </w:r>
     </w:p>
     <w:p>
@@ -1322,7 +1565,7 @@
         <w:rPr>
           <w:b w:val="0"/>
         </w:rPr>
-        <w:t>Если loop-устройство отсутствует или драйвер не поддерживается, обновите WSL в PowerShell командой wsl --update. Остановитесь при ошибке подключения файла; не продолжайте с пустым ff_loop.</w:t>
+        <w:t>Проверьте, что образ полный, несжатый, подключен с --partscan, а WSL работает в версии 2 и обновлен. При неподдерживаемом loop-драйвере остановитесь; не заменяйте loop-устройство системным диском WSL.</w:t>
       </w:r>
     </w:p>
     <w:p>
@@ -1330,7 +1573,7 @@
         <w:pStyle w:val="Heading2"/>
       </w:pPr>
       <w:r>
-        <w:t>Не устанавливается туннель на новом порту</w:t>
+        <w:t>Не работает API или туннель</w:t>
       </w:r>
     </w:p>
     <w:p>
@@ -1338,28 +1581,12 @@
         <w:rPr>
           <w:b w:val="0"/>
         </w:rPr>
-        <w:t>Проверьте сохраненный аргумент -R, доступность PPP, разрешение портов на сервере и ограничения permitlisten. Порт должен быть свободен, а ключ из /root/.ssh на устройстве должен быть авторизован у указанного SSH-пользователя сервера.</w:t>
+        <w:t>Для API проверьте Effective FuelFlux settings, доступность адреса, базовый путь, сертификат HTTPS и регистрацию ID. Ошибка подключения не включает резервный сервер. Для туннеля проверьте аргумент -R, PPP, занятость порта и permitlisten на SSH-сервере. Изменение URL API само по себе не меняет SSH-сервер.</w:t>
       </w:r>
     </w:p>
     <w:p>
       <w:pPr>
         <w:pStyle w:val="Heading2"/>
-      </w:pPr>
-      <w:r>
-        <w:t>Чем отличаются ID и SSH порт</w:t>
-      </w:r>
-    </w:p>
-    <w:p>
-      <w:r>
-        <w:rPr>
-          <w:b w:val="0"/>
-        </w:rPr>
-        <w:t>ID идентифицирует устройство в FuelFlux. Удаленный SSH-порт дает доступ к устройству через туннель. Изменение одного значения не меняет другое. Для каждого контроллера назначаются оба значения.</w:t>
-      </w:r>
-    </w:p>
-    <w:p>
-      <w:pPr>
-        <w:pStyle w:val="Heading1"/>
       </w:pPr>
       <w:r>
         <w:t>Справочные материалы</w:t>
@@ -1370,19 +1597,8 @@
         <w:rPr>
           <w:b w:val="0"/>
         </w:rPr>
-        <w:t>Команды применяются к образу на месте и к стандартным путям установки FuelFlux и fuelflux.srv. Сведения об исходниках проверены 24 октября 2026 года.</w:t>
+        <w:t>Процедура рассчитана на стандартные пути FuelFlux и установленную службу fuelflux.srv. Отсутствующий файл или отличающийся путь нужно выяснить до изменения образа. Примеры версий и ID подлежат согласованию для партии.</w:t>
       </w:r>
-    </w:p>
-    <w:p>
-      <w:hyperlink r:id="rId10">
-        <w:r>
-          <w:rPr>
-            <w:color w:val="000000"/>
-            <w:u w:val="single"/>
-          </w:rPr>
-          <w:t>Microsoft — установка WSL</w:t>
-        </w:r>
-      </w:hyperlink>
     </w:p>
     <w:p>
       <w:hyperlink r:id="rId11">
@@ -1391,7 +1607,7 @@
             <w:color w:val="000000"/>
             <w:u w:val="single"/>
           </w:rPr>
-          <w:t>Microsoft — файлы Windows и Linux в WSL</w:t>
+          <w:t>Microsoft  Установка WSL</w:t>
         </w:r>
       </w:hyperlink>
     </w:p>
@@ -1402,7 +1618,7 @@
             <w:color w:val="000000"/>
             <w:u w:val="single"/>
           </w:rPr>
-          <w:t>Linux — подключение образов командой losetup</w:t>
+          <w:t>Microsoft  Файлы Windows и Linux в WSL</w:t>
         </w:r>
       </w:hyperlink>
     </w:p>
@@ -1413,7 +1629,7 @@
             <w:color w:val="000000"/>
             <w:u w:val="single"/>
           </w:rPr>
-          <w:t>FuelFlux — чтение ID при запуске</w:t>
+          <w:t>Linux  losetup</w:t>
         </w:r>
       </w:hyperlink>
     </w:p>
@@ -1424,7 +1640,7 @@
             <w:color w:val="000000"/>
             <w:u w:val="single"/>
           </w:rPr>
-          <w:t>FuelFlux — создание API клиентов</w:t>
+          <w:t>HDDGURU  HDD Raw Copy Tool</w:t>
         </w:r>
       </w:hyperlink>
     </w:p>
@@ -1435,7 +1651,7 @@
             <w:color w:val="000000"/>
             <w:u w:val="single"/>
           </w:rPr>
-          <w:t>fuelflux srv — служба обратного SSH туннеля</w:t>
+          <w:t>FuelFlux  Исходники настройки при запуске</w:t>
         </w:r>
       </w:hyperlink>
     </w:p>
@@ -1446,7 +1662,7 @@
             <w:color w:val="000000"/>
             <w:u w:val="single"/>
           </w:rPr>
-          <w:t>fuelflux srv — установка и ограничения ключей</w:t>
+          <w:t>fuelflux srv  Служба туннеля</w:t>
         </w:r>
       </w:hyperlink>
     </w:p>

</xml_diff>